<commit_message>
Pre-refactor backup for institutional-grade enhancements
</commit_message>
<xml_diff>
--- a/Other Files/Prompt - Check for Institutional-Grade Standards Being Met After Code Refactoring & Reorganisation.docx
+++ b/Other Files/Prompt - Check for Institutional-Grade Standards Being Met After Code Refactoring & Reorganisation.docx
@@ -376,7 +376,15 @@
         <w:spacing w:line="240" w:lineRule="auto"/>
       </w:pPr>
       <w:r>
-        <w:t>- Regulatory Compliance, etc.</w:t>
+        <w:t>- Regulatory Compliance</w:t>
+      </w:r>
+    </w:p>
+    <w:p>
+      <w:pPr>
+        <w:spacing w:line="240" w:lineRule="auto"/>
+      </w:pPr>
+      <w:r>
+        <w:t>- Other related things</w:t>
       </w:r>
     </w:p>
     <w:p>
@@ -402,7 +410,6 @@
         <w:spacing w:line="240" w:lineRule="auto"/>
       </w:pPr>
       <w:r>
-        <w:lastRenderedPageBreak/>
         <w:t>B] Part 2: Comprehensive Documentation Creation (continuation (next part) of the exercise done in the previous task):</w:t>
       </w:r>
     </w:p>
@@ -1321,6 +1328,7 @@
   <w:style w:type="character" w:default="1" w:styleId="DefaultParagraphFont">
     <w:name w:val="Default Paragraph Font"/>
     <w:uiPriority w:val="1"/>
+    <w:semiHidden/>
     <w:unhideWhenUsed/>
   </w:style>
   <w:style w:type="table" w:default="1" w:styleId="TableNormal">

</xml_diff>